<commit_message>
chore(templates): update contract templates and forms (#882)
Routine refresh of contract template and external-form artifacts and catalog metadata. Contributions are welcome — open an issue or pull request and we'll fold it in.

Co-authored-by: OpenAgreements <noreply@openagreements.org>
</commit_message>
<xml_diff>
--- a/templates/openagreements-cc-by-4.0/openagreements-confidentiality-invention-assignment-agreement-nevada/template.docx
+++ b/templates/openagreements-cc-by-4.0/openagreements-confidentiality-invention-assignment-agreement-nevada/template.docx
@@ -7,7 +7,7 @@
         <w:pStyle w:val="OATitle"/>
       </w:pPr>
       <w:r>
-        <w:t xml:space="preserve">Confidentiality &amp; Invention Assignment Agreement (Nevada)</w:t>
+        <w:t xml:space="preserve">Confidential Information and Invention Assignment Agreement (Nevada)</w:t>
       </w:r>
     </w:p>
     <w:p>
@@ -1901,7 +1901,7 @@
         <w:sz w:val="18"/>
         <w:szCs w:val="18"/>
       </w:rPr>
-      <w:t xml:space="preserve">OpenAgreements Confidentiality &amp; Invention Assignment Agreement (Nevada) (v0.2.0). Free to use under CC BY 4.0</w:t>
+      <w:t xml:space="preserve">OpenAgreements Confidential Information and Invention Assignment Agreement (Nevada) (v0.2.0). Free to use under CC BY 4.0</w:t>
     </w:r>
     <w:r>
       <w:tab/>
@@ -2034,7 +2034,7 @@
         <w:sz w:val="18"/>
         <w:szCs w:val="18"/>
       </w:rPr>
-      <w:t xml:space="preserve">OpenAgreements Confidentiality &amp; Invention Assignment Agreement (Nevada) (v0.2.0). Free to use under CC BY 4.0</w:t>
+      <w:t xml:space="preserve">OpenAgreements Confidential Information and Invention Assignment Agreement (Nevada) (v0.2.0). Free to use under CC BY 4.0</w:t>
     </w:r>
     <w:r>
       <w:tab/>
@@ -2167,7 +2167,7 @@
         <w:sz w:val="18"/>
         <w:szCs w:val="18"/>
       </w:rPr>
-      <w:t xml:space="preserve">OpenAgreements Confidentiality &amp; Invention Assignment Agreement (Nevada) (v0.2.0). Free to use under CC BY 4.0</w:t>
+      <w:t xml:space="preserve">OpenAgreements Confidential Information and Invention Assignment Agreement (Nevada) (v0.2.0). Free to use under CC BY 4.0</w:t>
     </w:r>
     <w:r>
       <w:tab/>

</xml_diff>

<commit_message>
chore(templates): update contract templates and forms (#887)
Routine refresh of contract template and external-form artifacts and catalog metadata. Contributions are welcome — open an issue or pull request and we'll fold it in.

Co-authored-by: OpenAgreements <noreply@openagreements.org>
</commit_message>
<xml_diff>
--- a/templates/openagreements-cc-by-4.0/openagreements-confidentiality-invention-assignment-agreement-nevada/template.docx
+++ b/templates/openagreements-cc-by-4.0/openagreements-confidentiality-invention-assignment-agreement-nevada/template.docx
@@ -822,7 +822,7 @@
         <w:ind w:left="720"/>
       </w:pPr>
       <w:r>
-        <w:t xml:space="preserve">Nothing in this agreement restricts Employee from reporting possible violations of law to a government agency or attorney, making disclosures protected by whistleblower laws, or discussing wages, hours, or working conditions as protected by law. Employee does not need Company's prior approval to make those disclosures or to notify Company that they were made. Pursuant to the Defend Trade Secrets Act (18 U.S.C. § 1833(b)), Employee will not be held criminally or civilly liable under federal or state trade secret law for disclosing a trade secret in confidence to a government official or attorney solely to report or investigate a suspected violation of law, or in a court filing made under seal. Employee may also disclose a trade secret to Employee's attorney and use it in a retaliation lawsuit if any filing containing the trade secret is made under seal and the trade secret is not otherwise disclosed except by court order.</w:t>
+        <w:t xml:space="preserve">Nothing in this agreement restricts Employee from reporting possible violations of law to a government agency or attorney, making disclosures protected by whistleblower laws, or discussing wages, hours, or working conditions as protected by law. Employee does not need Company's prior approval to make those disclosures or to notify Company that they were made. Pursuant to the Defend Trade Secrets Act (18 U.S.C. § 1833(b)), Employee will not be held criminally or civilly liable under federal or state trade secret law for a disclosure of a trade secret that is made (a) in confidence to a federal, state, or local government official, either directly or indirectly, or to an attorney, solely for the purpose of reporting or investigating a suspected violation of law, or (b) in a complaint or other document filed in a lawsuit or other proceeding, if that filing is made under seal. Employee may also disclose a trade secret to Employee's attorney and use it in a lawsuit against Company for retaliation for reporting a suspected violation of law, if any filing containing the trade secret is made under seal and the trade secret is not otherwise disclosed except by court order.</w:t>
       </w:r>
     </w:p>
     <w:p>
@@ -1901,7 +1901,7 @@
         <w:sz w:val="18"/>
         <w:szCs w:val="18"/>
       </w:rPr>
-      <w:t xml:space="preserve">OpenAgreements Confidential Information and Invention Assignment Agreement (Nevada) (v0.2.0). Free to use under CC BY 4.0</w:t>
+      <w:t xml:space="preserve">OpenAgreements Confidential Information and Invention Assignment Agreement (Nevada) (v0.2.1). Free to use under CC BY 4.0</w:t>
     </w:r>
     <w:r>
       <w:tab/>
@@ -2034,7 +2034,7 @@
         <w:sz w:val="18"/>
         <w:szCs w:val="18"/>
       </w:rPr>
-      <w:t xml:space="preserve">OpenAgreements Confidential Information and Invention Assignment Agreement (Nevada) (v0.2.0). Free to use under CC BY 4.0</w:t>
+      <w:t xml:space="preserve">OpenAgreements Confidential Information and Invention Assignment Agreement (Nevada) (v0.2.1). Free to use under CC BY 4.0</w:t>
     </w:r>
     <w:r>
       <w:tab/>
@@ -2167,7 +2167,7 @@
         <w:sz w:val="18"/>
         <w:szCs w:val="18"/>
       </w:rPr>
-      <w:t xml:space="preserve">OpenAgreements Confidential Information and Invention Assignment Agreement (Nevada) (v0.2.0). Free to use under CC BY 4.0</w:t>
+      <w:t xml:space="preserve">OpenAgreements Confidential Information and Invention Assignment Agreement (Nevada) (v0.2.1). Free to use under CC BY 4.0</w:t>
     </w:r>
     <w:r>
       <w:tab/>

</xml_diff>